<commit_message>
docs: assemble verified study report and publish RTT confirmation block 4
</commit_message>
<xml_diff>
--- a/docs/31-phu-luc-bang-chung-thong-ke.docx
+++ b/docs/31-phu-luc-bang-chung-thong-ke.docx
@@ -12,7 +12,7 @@
     </w:p>
     <w:p>
       <w:r>
-        <w:t>Phụ lục đồ án NT531  •  Cập nhật 13/10/2026 12:00 giờ Việt Nam</w:t>
+        <w:t>Phụ lục đồ án NT531  •  Cập nhật 13/10/2026 16:10 giờ Việt Nam</w:t>
       </w:r>
     </w:p>
     <w:p>
@@ -211,7 +211,7 @@
                 <w:b w:val="0"/>
                 <w:sz w:val="21"/>
               </w:rPr>
-              <w:t>3/16</w:t>
+              <w:t>4/16</w:t>
             </w:r>
           </w:p>
         </w:tc>
@@ -4132,6 +4132,11 @@
     </w:p>
     <w:p>
       <w:r>
+        <w:t>[3] Sigman K. Notes on Little’s Law, 2009, phần 1–1.1. https://www.columbia.edu/~ks20/stochastic-I/stochastic-I-LL.pdf</w:t>
+      </w:r>
+    </w:p>
+    <w:p>
+      <w:r>
         <w:t>Công thức và tiêu chí bàn giao đầy đủ: tài liệu 27 và 30 trong thư mục docs. Chương kết quả vận chuyển cũ giữ nguyên dữ liệu lịch sử và không nhập vào cohort xác nhận mới.</w:t>
       </w:r>
     </w:p>
@@ -5626,6 +5631,994 @@
         <w:t>Mỗi điều kiện dùng fresh server, warm-up và drain; cùng mã ứng dụng/MTU/cohort. SCP chỉ tải sau capture, host key pin qua SSM, đối chiếu size/SHA. Trước block này có attempt kỹ thuật bị guard uptime chặn: giữ lỗi và quyết định retry, chưa thu outcome; không chọn lại vì kết quả.</w:t>
       </w:r>
     </w:p>
+    <w:p>
+      <w:r>
+        <w:br w:type="page"/>
+      </w:r>
+    </w:p>
+    <w:p>
+      <w:pPr>
+        <w:pStyle w:val="Heading1"/>
+      </w:pPr>
+      <w:r>
+        <w:t>Số lời gọi đang chờ và định luật Little</w:t>
+      </w:r>
+    </w:p>
+    <w:p>
+      <w:r>
+        <w:t>Phân tích mô tả từ block slots 1, không tạo thêm mẫu xác nhận. Ghép request ID đo, loại warm-up và giữ lời gọi hủy. Mỗi worker có cửa sổ riêng chứa trọn từ entry đầu đến exit cuối, gồm đuôi backlog.</w:t>
+      </w:r>
+    </w:p>
+    <w:p>
+      <w:pPr>
+        <w:keepNext/>
+        <w:spacing w:before="60" w:after="140"/>
+        <w:jc w:val="center"/>
+      </w:pPr>
+      <m:oMathPara>
+        <m:oMath>
+          <m:sSub>
+            <m:e>
+              <m:r>
+                <w:rPr>
+                  <w:rFonts w:ascii="Cambria Math" w:hAnsi="Cambria Math"/>
+                  <w:sz w:val="24"/>
+                </w:rPr>
+                <m:t xml:space="preserve">λ</m:t>
+              </m:r>
+            </m:e>
+            <m:sub>
+              <m:r>
+                <w:rPr>
+                  <w:rFonts w:ascii="Cambria Math" w:hAnsi="Cambria Math"/>
+                  <w:sz w:val="24"/>
+                </w:rPr>
+                <m:t xml:space="preserve">C</m:t>
+              </m:r>
+            </m:sub>
+          </m:sSub>
+          <m:r>
+            <w:rPr>
+              <w:rFonts w:ascii="Cambria Math" w:hAnsi="Cambria Math"/>
+              <w:sz w:val="24"/>
+            </w:rPr>
+            <m:t xml:space="preserve"> = </m:t>
+          </m:r>
+          <m:f>
+            <m:num>
+              <m:r>
+                <w:rPr>
+                  <w:rFonts w:ascii="Cambria Math" w:hAnsi="Cambria Math"/>
+                  <w:sz w:val="24"/>
+                </w:rPr>
+                <m:t xml:space="preserve">N</m:t>
+              </m:r>
+            </m:num>
+            <m:den>
+              <m:r>
+                <w:rPr>
+                  <w:rFonts w:ascii="Cambria Math" w:hAnsi="Cambria Math"/>
+                  <w:sz w:val="24"/>
+                </w:rPr>
+                <m:t xml:space="preserve">T</m:t>
+              </m:r>
+            </m:den>
+          </m:f>
+          <m:r>
+            <w:rPr>
+              <w:rFonts w:ascii="Cambria Math" w:hAnsi="Cambria Math"/>
+              <w:sz w:val="24"/>
+            </w:rPr>
+            <m:t xml:space="preserve">    (9)</m:t>
+          </m:r>
+        </m:oMath>
+      </m:oMathPara>
+    </w:p>
+    <w:p>
+      <w:pPr>
+        <w:keepNext/>
+        <w:spacing w:before="60" w:after="140"/>
+        <w:jc w:val="center"/>
+      </w:pPr>
+      <m:oMathPara>
+        <m:oMath>
+          <m:sSub>
+            <m:e>
+              <m:r>
+                <w:rPr>
+                  <w:rFonts w:ascii="Cambria Math" w:hAnsi="Cambria Math"/>
+                  <w:sz w:val="24"/>
+                </w:rPr>
+                <m:t xml:space="preserve">L</m:t>
+              </m:r>
+            </m:e>
+            <m:sub>
+              <m:r>
+                <w:rPr>
+                  <w:rFonts w:ascii="Cambria Math" w:hAnsi="Cambria Math"/>
+                  <w:sz w:val="24"/>
+                </w:rPr>
+                <m:t xml:space="preserve">q,C</m:t>
+              </m:r>
+            </m:sub>
+          </m:sSub>
+          <m:r>
+            <w:rPr>
+              <w:rFonts w:ascii="Cambria Math" w:hAnsi="Cambria Math"/>
+              <w:sz w:val="24"/>
+            </w:rPr>
+            <m:t xml:space="preserve"> = </m:t>
+          </m:r>
+          <m:f>
+            <m:num>
+              <m:sSubSup>
+                <m:e>
+                  <m:r>
+                    <w:rPr>
+                      <w:rFonts w:ascii="Cambria Math" w:hAnsi="Cambria Math"/>
+                      <w:sz w:val="24"/>
+                    </w:rPr>
+                    <m:t xml:space="preserve">∑</m:t>
+                  </m:r>
+                </m:e>
+                <m:sub>
+                  <m:r>
+                    <w:rPr>
+                      <w:rFonts w:ascii="Cambria Math" w:hAnsi="Cambria Math"/>
+                      <w:sz w:val="24"/>
+                    </w:rPr>
+                    <m:t xml:space="preserve">i = 1</m:t>
+                  </m:r>
+                </m:sub>
+                <m:sup>
+                  <m:r>
+                    <w:rPr>
+                      <w:rFonts w:ascii="Cambria Math" w:hAnsi="Cambria Math"/>
+                      <w:sz w:val="24"/>
+                    </w:rPr>
+                    <m:t xml:space="preserve">N</m:t>
+                  </m:r>
+                </m:sup>
+              </m:sSubSup>
+              <m:sSub>
+                <m:e>
+                  <m:r>
+                    <w:rPr>
+                      <w:rFonts w:ascii="Cambria Math" w:hAnsi="Cambria Math"/>
+                      <w:sz w:val="24"/>
+                    </w:rPr>
+                    <m:t xml:space="preserve">W</m:t>
+                  </m:r>
+                </m:e>
+                <m:sub>
+                  <m:r>
+                    <w:rPr>
+                      <w:rFonts w:ascii="Cambria Math" w:hAnsi="Cambria Math"/>
+                      <w:sz w:val="24"/>
+                    </w:rPr>
+                    <m:t xml:space="preserve">q,i</m:t>
+                  </m:r>
+                </m:sub>
+              </m:sSub>
+            </m:num>
+            <m:den>
+              <m:r>
+                <w:rPr>
+                  <w:rFonts w:ascii="Cambria Math" w:hAnsi="Cambria Math"/>
+                  <w:sz w:val="24"/>
+                </w:rPr>
+                <m:t xml:space="preserve">T</m:t>
+              </m:r>
+            </m:den>
+          </m:f>
+          <m:r>
+            <w:rPr>
+              <w:rFonts w:ascii="Cambria Math" w:hAnsi="Cambria Math"/>
+              <w:sz w:val="24"/>
+            </w:rPr>
+            <m:t xml:space="preserve"> = </m:t>
+          </m:r>
+          <m:sSub>
+            <m:e>
+              <m:r>
+                <w:rPr>
+                  <w:rFonts w:ascii="Cambria Math" w:hAnsi="Cambria Math"/>
+                  <w:sz w:val="24"/>
+                </w:rPr>
+                <m:t xml:space="preserve">λ</m:t>
+              </m:r>
+            </m:e>
+            <m:sub>
+              <m:r>
+                <w:rPr>
+                  <w:rFonts w:ascii="Cambria Math" w:hAnsi="Cambria Math"/>
+                  <w:sz w:val="24"/>
+                </w:rPr>
+                <m:t xml:space="preserve">C</m:t>
+              </m:r>
+            </m:sub>
+          </m:sSub>
+          <m:r>
+            <w:rPr>
+              <w:rFonts w:ascii="Cambria Math" w:hAnsi="Cambria Math"/>
+              <w:sz w:val="24"/>
+            </w:rPr>
+            <m:t xml:space="preserve"> × </m:t>
+          </m:r>
+          <m:sSub>
+            <m:e>
+              <m:r>
+                <w:rPr>
+                  <w:rFonts w:ascii="Cambria Math" w:hAnsi="Cambria Math"/>
+                  <w:sz w:val="24"/>
+                </w:rPr>
+                <m:t xml:space="preserve">W</m:t>
+              </m:r>
+            </m:e>
+            <m:sub>
+              <m:r>
+                <w:rPr>
+                  <w:rFonts w:ascii="Cambria Math" w:hAnsi="Cambria Math"/>
+                  <w:sz w:val="24"/>
+                </w:rPr>
+                <m:t xml:space="preserve">q,mean</m:t>
+              </m:r>
+            </m:sub>
+          </m:sSub>
+          <m:r>
+            <w:rPr>
+              <w:rFonts w:ascii="Cambria Math" w:hAnsi="Cambria Math"/>
+              <w:sz w:val="24"/>
+            </w:rPr>
+            <m:t xml:space="preserve">    (10)</m:t>
+          </m:r>
+        </m:oMath>
+      </m:oMathPara>
+    </w:p>
+    <w:p>
+      <w:r>
+        <w:t>N là số lời gọi vào worker; T là độ dài cửa sổ theo giây; Wq,i là thời gian chờ của lời gọi i, giây; Wq,mean là mean của N thời gian chờ. Lq,C là số lời gọi trung bình đang chờ, λC là N/T, lời gọi/s. Không thay mean bằng P95 hoặc N/T bằng rate gửi 800 khi cửa sổ có đuôi.</w:t>
+      </w:r>
+    </w:p>
+    <w:tbl>
+      <w:tblPr>
+        <w:tblW w:type="auto" w:w="0"/>
+        <w:tblLayout w:type="fixed"/>
+        <w:tblLook w:firstColumn="1" w:firstRow="1" w:lastColumn="0" w:lastRow="0" w:noHBand="0" w:noVBand="1" w:val="04A0"/>
+        <w:tblBorders>
+          <w:top w:val="single" w:sz="4" w:color="D9D9D9"/>
+          <w:left w:val="single" w:sz="4" w:color="D9D9D9"/>
+          <w:bottom w:val="single" w:sz="4" w:color="D9D9D9"/>
+          <w:right w:val="single" w:sz="4" w:color="D9D9D9"/>
+          <w:insideH w:val="single" w:sz="4" w:color="D9D9D9"/>
+          <w:insideV w:val="single" w:sz="4" w:color="D9D9D9"/>
+        </w:tblBorders>
+      </w:tblPr>
+      <w:tblGrid>
+        <w:gridCol w:w="1800"/>
+        <w:gridCol w:w="936"/>
+        <w:gridCol w:w="1872"/>
+        <w:gridCol w:w="2592"/>
+        <w:gridCol w:w="2736"/>
+      </w:tblGrid>
+      <w:tr>
+        <w:trPr>
+          <w:tblHeader/>
+        </w:trPr>
+        <w:tc>
+          <w:tcPr>
+            <w:tcW w:type="dxa" w:w="1800"/>
+            <w:vAlign w:val="center"/>
+            <w:shd w:fill="E8EEF5"/>
+            <w:tcMar>
+              <w:top w:w="85" w:type="dxa"/>
+              <w:left w:w="85" w:type="dxa"/>
+              <w:bottom w:w="85" w:type="dxa"/>
+              <w:right w:w="85" w:type="dxa"/>
+            </w:tcMar>
+          </w:tcPr>
+          <w:p>
+            <w:pPr>
+              <w:spacing w:after="20" w:line="252" w:lineRule="auto"/>
+              <w:jc w:val="left"/>
+            </w:pPr>
+            <w:r>
+              <w:rPr>
+                <w:b/>
+                <w:sz w:val="21"/>
+              </w:rPr>
+              <w:t>Mạng</w:t>
+            </w:r>
+          </w:p>
+        </w:tc>
+        <w:tc>
+          <w:tcPr>
+            <w:tcW w:type="dxa" w:w="936"/>
+            <w:vAlign w:val="center"/>
+            <w:shd w:fill="E8EEF5"/>
+            <w:tcMar>
+              <w:top w:w="85" w:type="dxa"/>
+              <w:left w:w="85" w:type="dxa"/>
+              <w:bottom w:w="85" w:type="dxa"/>
+              <w:right w:w="85" w:type="dxa"/>
+            </w:tcMar>
+          </w:tcPr>
+          <w:p>
+            <w:pPr>
+              <w:spacing w:after="20" w:line="252" w:lineRule="auto"/>
+              <w:jc w:val="center"/>
+            </w:pPr>
+            <w:r>
+              <w:rPr>
+                <w:b/>
+                <w:sz w:val="21"/>
+              </w:rPr>
+              <w:t>Slots</w:t>
+            </w:r>
+          </w:p>
+        </w:tc>
+        <w:tc>
+          <w:tcPr>
+            <w:tcW w:type="dxa" w:w="1872"/>
+            <w:vAlign w:val="center"/>
+            <w:shd w:fill="E8EEF5"/>
+            <w:tcMar>
+              <w:top w:w="85" w:type="dxa"/>
+              <w:left w:w="85" w:type="dxa"/>
+              <w:bottom w:w="85" w:type="dxa"/>
+              <w:right w:w="85" w:type="dxa"/>
+            </w:tcMar>
+          </w:tcPr>
+          <w:p>
+            <w:pPr>
+              <w:spacing w:after="20" w:line="252" w:lineRule="auto"/>
+              <w:jc w:val="center"/>
+            </w:pPr>
+            <w:r>
+              <w:rPr>
+                <w:b/>
+                <w:sz w:val="21"/>
+              </w:rPr>
+              <w:t>N/T mỗi s</w:t>
+            </w:r>
+          </w:p>
+        </w:tc>
+        <w:tc>
+          <w:tcPr>
+            <w:tcW w:type="dxa" w:w="2592"/>
+            <w:vAlign w:val="center"/>
+            <w:shd w:fill="E8EEF5"/>
+            <w:tcMar>
+              <w:top w:w="85" w:type="dxa"/>
+              <w:left w:w="85" w:type="dxa"/>
+              <w:bottom w:w="85" w:type="dxa"/>
+              <w:right w:w="85" w:type="dxa"/>
+            </w:tcMar>
+          </w:tcPr>
+          <w:p>
+            <w:pPr>
+              <w:spacing w:after="20" w:line="252" w:lineRule="auto"/>
+              <w:jc w:val="center"/>
+            </w:pPr>
+            <w:r>
+              <w:rPr>
+                <w:b/>
+                <w:sz w:val="21"/>
+              </w:rPr>
+              <w:t>Mean chờ ms</w:t>
+            </w:r>
+          </w:p>
+        </w:tc>
+        <w:tc>
+          <w:tcPr>
+            <w:tcW w:type="dxa" w:w="2736"/>
+            <w:vAlign w:val="center"/>
+            <w:shd w:fill="E8EEF5"/>
+            <w:tcMar>
+              <w:top w:w="85" w:type="dxa"/>
+              <w:left w:w="85" w:type="dxa"/>
+              <w:bottom w:w="85" w:type="dxa"/>
+              <w:right w:w="85" w:type="dxa"/>
+            </w:tcMar>
+          </w:tcPr>
+          <w:p>
+            <w:pPr>
+              <w:spacing w:after="20" w:line="252" w:lineRule="auto"/>
+              <w:jc w:val="center"/>
+            </w:pPr>
+            <w:r>
+              <w:rPr>
+                <w:b/>
+                <w:sz w:val="21"/>
+              </w:rPr>
+              <w:t>Mean số chờ C</w:t>
+            </w:r>
+          </w:p>
+        </w:tc>
+      </w:tr>
+      <w:tr>
+        <w:tc>
+          <w:tcPr>
+            <w:tcW w:type="dxa" w:w="1800"/>
+            <w:vAlign w:val="center"/>
+            <w:shd w:fill="FFFFFF"/>
+            <w:tcMar>
+              <w:top w:w="85" w:type="dxa"/>
+              <w:left w:w="85" w:type="dxa"/>
+              <w:bottom w:w="85" w:type="dxa"/>
+              <w:right w:w="85" w:type="dxa"/>
+            </w:tcMar>
+          </w:tcPr>
+          <w:p>
+            <w:pPr>
+              <w:spacing w:after="20" w:line="252" w:lineRule="auto"/>
+              <w:jc w:val="left"/>
+            </w:pPr>
+            <w:r>
+              <w:rPr>
+                <w:b w:val="0"/>
+                <w:sz w:val="21"/>
+              </w:rPr>
+              <w:t>PEERING</w:t>
+            </w:r>
+          </w:p>
+        </w:tc>
+        <w:tc>
+          <w:tcPr>
+            <w:tcW w:type="dxa" w:w="936"/>
+            <w:vAlign w:val="center"/>
+            <w:shd w:fill="FFFFFF"/>
+            <w:tcMar>
+              <w:top w:w="85" w:type="dxa"/>
+              <w:left w:w="85" w:type="dxa"/>
+              <w:bottom w:w="85" w:type="dxa"/>
+              <w:right w:w="85" w:type="dxa"/>
+            </w:tcMar>
+          </w:tcPr>
+          <w:p>
+            <w:pPr>
+              <w:spacing w:after="20" w:line="252" w:lineRule="auto"/>
+              <w:jc w:val="center"/>
+            </w:pPr>
+            <w:r>
+              <w:rPr>
+                <w:b w:val="0"/>
+                <w:sz w:val="21"/>
+              </w:rPr>
+              <w:t>8</w:t>
+            </w:r>
+          </w:p>
+        </w:tc>
+        <w:tc>
+          <w:tcPr>
+            <w:tcW w:type="dxa" w:w="1872"/>
+            <w:vAlign w:val="center"/>
+            <w:shd w:fill="FFFFFF"/>
+            <w:tcMar>
+              <w:top w:w="85" w:type="dxa"/>
+              <w:left w:w="85" w:type="dxa"/>
+              <w:bottom w:w="85" w:type="dxa"/>
+              <w:right w:w="85" w:type="dxa"/>
+            </w:tcMar>
+          </w:tcPr>
+          <w:p>
+            <w:pPr>
+              <w:spacing w:after="20" w:line="252" w:lineRule="auto"/>
+              <w:jc w:val="center"/>
+            </w:pPr>
+            <w:r>
+              <w:rPr>
+                <w:b w:val="0"/>
+                <w:sz w:val="21"/>
+              </w:rPr>
+              <w:t>726.588</w:t>
+            </w:r>
+          </w:p>
+        </w:tc>
+        <w:tc>
+          <w:tcPr>
+            <w:tcW w:type="dxa" w:w="2592"/>
+            <w:vAlign w:val="center"/>
+            <w:shd w:fill="FFFFFF"/>
+            <w:tcMar>
+              <w:top w:w="85" w:type="dxa"/>
+              <w:left w:w="85" w:type="dxa"/>
+              <w:bottom w:w="85" w:type="dxa"/>
+              <w:right w:w="85" w:type="dxa"/>
+            </w:tcMar>
+          </w:tcPr>
+          <w:p>
+            <w:pPr>
+              <w:spacing w:after="20" w:line="252" w:lineRule="auto"/>
+              <w:jc w:val="center"/>
+            </w:pPr>
+            <w:r>
+              <w:rPr>
+                <w:b w:val="0"/>
+                <w:sz w:val="21"/>
+              </w:rPr>
+              <w:t>790.634200</w:t>
+            </w:r>
+          </w:p>
+        </w:tc>
+        <w:tc>
+          <w:tcPr>
+            <w:tcW w:type="dxa" w:w="2736"/>
+            <w:vAlign w:val="center"/>
+            <w:shd w:fill="FFFFFF"/>
+            <w:tcMar>
+              <w:top w:w="85" w:type="dxa"/>
+              <w:left w:w="85" w:type="dxa"/>
+              <w:bottom w:w="85" w:type="dxa"/>
+              <w:right w:w="85" w:type="dxa"/>
+            </w:tcMar>
+          </w:tcPr>
+          <w:p>
+            <w:pPr>
+              <w:spacing w:after="20" w:line="252" w:lineRule="auto"/>
+              <w:jc w:val="center"/>
+            </w:pPr>
+            <w:r>
+              <w:rPr>
+                <w:b w:val="0"/>
+                <w:sz w:val="21"/>
+              </w:rPr>
+              <w:t>574.465294</w:t>
+            </w:r>
+          </w:p>
+        </w:tc>
+      </w:tr>
+      <w:tr>
+        <w:tc>
+          <w:tcPr>
+            <w:tcW w:type="dxa" w:w="1800"/>
+            <w:vAlign w:val="center"/>
+            <w:shd w:fill="F5F7FA"/>
+            <w:tcMar>
+              <w:top w:w="85" w:type="dxa"/>
+              <w:left w:w="85" w:type="dxa"/>
+              <w:bottom w:w="85" w:type="dxa"/>
+              <w:right w:w="85" w:type="dxa"/>
+            </w:tcMar>
+          </w:tcPr>
+          <w:p>
+            <w:pPr>
+              <w:spacing w:after="20" w:line="252" w:lineRule="auto"/>
+              <w:jc w:val="left"/>
+            </w:pPr>
+            <w:r>
+              <w:rPr>
+                <w:b w:val="0"/>
+                <w:sz w:val="21"/>
+              </w:rPr>
+              <w:t>PEERING</w:t>
+            </w:r>
+          </w:p>
+        </w:tc>
+        <w:tc>
+          <w:tcPr>
+            <w:tcW w:type="dxa" w:w="936"/>
+            <w:vAlign w:val="center"/>
+            <w:shd w:fill="F5F7FA"/>
+            <w:tcMar>
+              <w:top w:w="85" w:type="dxa"/>
+              <w:left w:w="85" w:type="dxa"/>
+              <w:bottom w:w="85" w:type="dxa"/>
+              <w:right w:w="85" w:type="dxa"/>
+            </w:tcMar>
+          </w:tcPr>
+          <w:p>
+            <w:pPr>
+              <w:spacing w:after="20" w:line="252" w:lineRule="auto"/>
+              <w:jc w:val="center"/>
+            </w:pPr>
+            <w:r>
+              <w:rPr>
+                <w:b w:val="0"/>
+                <w:sz w:val="21"/>
+              </w:rPr>
+              <w:t>16</w:t>
+            </w:r>
+          </w:p>
+        </w:tc>
+        <w:tc>
+          <w:tcPr>
+            <w:tcW w:type="dxa" w:w="1872"/>
+            <w:vAlign w:val="center"/>
+            <w:shd w:fill="F5F7FA"/>
+            <w:tcMar>
+              <w:top w:w="85" w:type="dxa"/>
+              <w:left w:w="85" w:type="dxa"/>
+              <w:bottom w:w="85" w:type="dxa"/>
+              <w:right w:w="85" w:type="dxa"/>
+            </w:tcMar>
+          </w:tcPr>
+          <w:p>
+            <w:pPr>
+              <w:spacing w:after="20" w:line="252" w:lineRule="auto"/>
+              <w:jc w:val="center"/>
+            </w:pPr>
+            <w:r>
+              <w:rPr>
+                <w:b w:val="0"/>
+                <w:sz w:val="21"/>
+              </w:rPr>
+              <w:t>799.529</w:t>
+            </w:r>
+          </w:p>
+        </w:tc>
+        <w:tc>
+          <w:tcPr>
+            <w:tcW w:type="dxa" w:w="2592"/>
+            <w:vAlign w:val="center"/>
+            <w:shd w:fill="F5F7FA"/>
+            <w:tcMar>
+              <w:top w:w="85" w:type="dxa"/>
+              <w:left w:w="85" w:type="dxa"/>
+              <w:bottom w:w="85" w:type="dxa"/>
+              <w:right w:w="85" w:type="dxa"/>
+            </w:tcMar>
+          </w:tcPr>
+          <w:p>
+            <w:pPr>
+              <w:spacing w:after="20" w:line="252" w:lineRule="auto"/>
+              <w:jc w:val="center"/>
+            </w:pPr>
+            <w:r>
+              <w:rPr>
+                <w:b w:val="0"/>
+                <w:sz w:val="21"/>
+              </w:rPr>
+              <w:t>0.005352</w:t>
+            </w:r>
+          </w:p>
+        </w:tc>
+        <w:tc>
+          <w:tcPr>
+            <w:tcW w:type="dxa" w:w="2736"/>
+            <w:vAlign w:val="center"/>
+            <w:shd w:fill="F5F7FA"/>
+            <w:tcMar>
+              <w:top w:w="85" w:type="dxa"/>
+              <w:left w:w="85" w:type="dxa"/>
+              <w:bottom w:w="85" w:type="dxa"/>
+              <w:right w:w="85" w:type="dxa"/>
+            </w:tcMar>
+          </w:tcPr>
+          <w:p>
+            <w:pPr>
+              <w:spacing w:after="20" w:line="252" w:lineRule="auto"/>
+              <w:jc w:val="center"/>
+            </w:pPr>
+            <w:r>
+              <w:rPr>
+                <w:b w:val="0"/>
+                <w:sz w:val="21"/>
+              </w:rPr>
+              <w:t>0.004279</w:t>
+            </w:r>
+          </w:p>
+        </w:tc>
+      </w:tr>
+      <w:tr>
+        <w:tc>
+          <w:tcPr>
+            <w:tcW w:type="dxa" w:w="1800"/>
+            <w:vAlign w:val="center"/>
+            <w:shd w:fill="FFFFFF"/>
+            <w:tcMar>
+              <w:top w:w="85" w:type="dxa"/>
+              <w:left w:w="85" w:type="dxa"/>
+              <w:bottom w:w="85" w:type="dxa"/>
+              <w:right w:w="85" w:type="dxa"/>
+            </w:tcMar>
+          </w:tcPr>
+          <w:p>
+            <w:pPr>
+              <w:spacing w:after="20" w:line="252" w:lineRule="auto"/>
+              <w:jc w:val="left"/>
+            </w:pPr>
+            <w:r>
+              <w:rPr>
+                <w:b w:val="0"/>
+                <w:sz w:val="21"/>
+              </w:rPr>
+              <w:t>TGW</w:t>
+            </w:r>
+          </w:p>
+        </w:tc>
+        <w:tc>
+          <w:tcPr>
+            <w:tcW w:type="dxa" w:w="936"/>
+            <w:vAlign w:val="center"/>
+            <w:shd w:fill="FFFFFF"/>
+            <w:tcMar>
+              <w:top w:w="85" w:type="dxa"/>
+              <w:left w:w="85" w:type="dxa"/>
+              <w:bottom w:w="85" w:type="dxa"/>
+              <w:right w:w="85" w:type="dxa"/>
+            </w:tcMar>
+          </w:tcPr>
+          <w:p>
+            <w:pPr>
+              <w:spacing w:after="20" w:line="252" w:lineRule="auto"/>
+              <w:jc w:val="center"/>
+            </w:pPr>
+            <w:r>
+              <w:rPr>
+                <w:b w:val="0"/>
+                <w:sz w:val="21"/>
+              </w:rPr>
+              <w:t>8</w:t>
+            </w:r>
+          </w:p>
+        </w:tc>
+        <w:tc>
+          <w:tcPr>
+            <w:tcW w:type="dxa" w:w="1872"/>
+            <w:vAlign w:val="center"/>
+            <w:shd w:fill="FFFFFF"/>
+            <w:tcMar>
+              <w:top w:w="85" w:type="dxa"/>
+              <w:left w:w="85" w:type="dxa"/>
+              <w:bottom w:w="85" w:type="dxa"/>
+              <w:right w:w="85" w:type="dxa"/>
+            </w:tcMar>
+          </w:tcPr>
+          <w:p>
+            <w:pPr>
+              <w:spacing w:after="20" w:line="252" w:lineRule="auto"/>
+              <w:jc w:val="center"/>
+            </w:pPr>
+            <w:r>
+              <w:rPr>
+                <w:b w:val="0"/>
+                <w:sz w:val="21"/>
+              </w:rPr>
+              <w:t>733.134</w:t>
+            </w:r>
+          </w:p>
+        </w:tc>
+        <w:tc>
+          <w:tcPr>
+            <w:tcW w:type="dxa" w:w="2592"/>
+            <w:vAlign w:val="center"/>
+            <w:shd w:fill="FFFFFF"/>
+            <w:tcMar>
+              <w:top w:w="85" w:type="dxa"/>
+              <w:left w:w="85" w:type="dxa"/>
+              <w:bottom w:w="85" w:type="dxa"/>
+              <w:right w:w="85" w:type="dxa"/>
+            </w:tcMar>
+          </w:tcPr>
+          <w:p>
+            <w:pPr>
+              <w:spacing w:after="20" w:line="252" w:lineRule="auto"/>
+              <w:jc w:val="center"/>
+            </w:pPr>
+            <w:r>
+              <w:rPr>
+                <w:b w:val="0"/>
+                <w:sz w:val="21"/>
+              </w:rPr>
+              <w:t>683.339376</w:t>
+            </w:r>
+          </w:p>
+        </w:tc>
+        <w:tc>
+          <w:tcPr>
+            <w:tcW w:type="dxa" w:w="2736"/>
+            <w:vAlign w:val="center"/>
+            <w:shd w:fill="FFFFFF"/>
+            <w:tcMar>
+              <w:top w:w="85" w:type="dxa"/>
+              <w:left w:w="85" w:type="dxa"/>
+              <w:bottom w:w="85" w:type="dxa"/>
+              <w:right w:w="85" w:type="dxa"/>
+            </w:tcMar>
+          </w:tcPr>
+          <w:p>
+            <w:pPr>
+              <w:spacing w:after="20" w:line="252" w:lineRule="auto"/>
+              <w:jc w:val="center"/>
+            </w:pPr>
+            <w:r>
+              <w:rPr>
+                <w:b w:val="0"/>
+                <w:sz w:val="21"/>
+              </w:rPr>
+              <w:t>500.979448</w:t>
+            </w:r>
+          </w:p>
+        </w:tc>
+      </w:tr>
+      <w:tr>
+        <w:tc>
+          <w:tcPr>
+            <w:tcW w:type="dxa" w:w="1800"/>
+            <w:vAlign w:val="center"/>
+            <w:shd w:fill="F5F7FA"/>
+            <w:tcMar>
+              <w:top w:w="85" w:type="dxa"/>
+              <w:left w:w="85" w:type="dxa"/>
+              <w:bottom w:w="85" w:type="dxa"/>
+              <w:right w:w="85" w:type="dxa"/>
+            </w:tcMar>
+          </w:tcPr>
+          <w:p>
+            <w:pPr>
+              <w:spacing w:after="20" w:line="252" w:lineRule="auto"/>
+              <w:jc w:val="left"/>
+            </w:pPr>
+            <w:r>
+              <w:rPr>
+                <w:b w:val="0"/>
+                <w:sz w:val="21"/>
+              </w:rPr>
+              <w:t>TGW</w:t>
+            </w:r>
+          </w:p>
+        </w:tc>
+        <w:tc>
+          <w:tcPr>
+            <w:tcW w:type="dxa" w:w="936"/>
+            <w:vAlign w:val="center"/>
+            <w:shd w:fill="F5F7FA"/>
+            <w:tcMar>
+              <w:top w:w="85" w:type="dxa"/>
+              <w:left w:w="85" w:type="dxa"/>
+              <w:bottom w:w="85" w:type="dxa"/>
+              <w:right w:w="85" w:type="dxa"/>
+            </w:tcMar>
+          </w:tcPr>
+          <w:p>
+            <w:pPr>
+              <w:spacing w:after="20" w:line="252" w:lineRule="auto"/>
+              <w:jc w:val="center"/>
+            </w:pPr>
+            <w:r>
+              <w:rPr>
+                <w:b w:val="0"/>
+                <w:sz w:val="21"/>
+              </w:rPr>
+              <w:t>16</w:t>
+            </w:r>
+          </w:p>
+        </w:tc>
+        <w:tc>
+          <w:tcPr>
+            <w:tcW w:type="dxa" w:w="1872"/>
+            <w:vAlign w:val="center"/>
+            <w:shd w:fill="F5F7FA"/>
+            <w:tcMar>
+              <w:top w:w="85" w:type="dxa"/>
+              <w:left w:w="85" w:type="dxa"/>
+              <w:bottom w:w="85" w:type="dxa"/>
+              <w:right w:w="85" w:type="dxa"/>
+            </w:tcMar>
+          </w:tcPr>
+          <w:p>
+            <w:pPr>
+              <w:spacing w:after="20" w:line="252" w:lineRule="auto"/>
+              <w:jc w:val="center"/>
+            </w:pPr>
+            <w:r>
+              <w:rPr>
+                <w:b w:val="0"/>
+                <w:sz w:val="21"/>
+              </w:rPr>
+              <w:t>799.601</w:t>
+            </w:r>
+          </w:p>
+        </w:tc>
+        <w:tc>
+          <w:tcPr>
+            <w:tcW w:type="dxa" w:w="2592"/>
+            <w:vAlign w:val="center"/>
+            <w:shd w:fill="F5F7FA"/>
+            <w:tcMar>
+              <w:top w:w="85" w:type="dxa"/>
+              <w:left w:w="85" w:type="dxa"/>
+              <w:bottom w:w="85" w:type="dxa"/>
+              <w:right w:w="85" w:type="dxa"/>
+            </w:tcMar>
+          </w:tcPr>
+          <w:p>
+            <w:pPr>
+              <w:spacing w:after="20" w:line="252" w:lineRule="auto"/>
+              <w:jc w:val="center"/>
+            </w:pPr>
+            <w:r>
+              <w:rPr>
+                <w:b w:val="0"/>
+                <w:sz w:val="21"/>
+              </w:rPr>
+              <w:t>0.005378</w:t>
+            </w:r>
+          </w:p>
+        </w:tc>
+        <w:tc>
+          <w:tcPr>
+            <w:tcW w:type="dxa" w:w="2736"/>
+            <w:vAlign w:val="center"/>
+            <w:shd w:fill="F5F7FA"/>
+            <w:tcMar>
+              <w:top w:w="85" w:type="dxa"/>
+              <w:left w:w="85" w:type="dxa"/>
+              <w:bottom w:w="85" w:type="dxa"/>
+              <w:right w:w="85" w:type="dxa"/>
+            </w:tcMar>
+          </w:tcPr>
+          <w:p>
+            <w:pPr>
+              <w:spacing w:after="20" w:line="252" w:lineRule="auto"/>
+              <w:jc w:val="center"/>
+            </w:pPr>
+            <w:r>
+              <w:rPr>
+                <w:b w:val="0"/>
+                <w:sz w:val="21"/>
+              </w:rPr>
+              <w:t>0.004300</w:t>
+            </w:r>
+          </w:p>
+        </w:tc>
+      </w:tr>
+    </w:tbl>
+    <w:p>
+      <w:pPr>
+        <w:spacing w:after="20"/>
+      </w:pPr>
+    </w:p>
+    <w:p>
+      <w:r>
+        <w:drawing>
+          <wp:inline xmlns:a="http://schemas.openxmlformats.org/drawingml/2006/main" xmlns:pic="http://schemas.openxmlformats.org/drawingml/2006/picture">
+            <wp:extent cx="5669280" cy="3607724"/>
+            <wp:docPr id="2" name="Picture 2"/>
+            <wp:cNvGraphicFramePr>
+              <a:graphicFrameLocks noChangeAspect="1"/>
+            </wp:cNvGraphicFramePr>
+            <a:graphic>
+              <a:graphicData uri="http://schemas.openxmlformats.org/drawingml/2006/picture">
+                <pic:pic>
+                  <pic:nvPicPr>
+                    <pic:cNvPr id="0" name="block-01-queue.png"/>
+                    <pic:cNvPicPr/>
+                  </pic:nvPicPr>
+                  <pic:blipFill>
+                    <a:blip r:embed="rId11"/>
+                    <a:stretch>
+                      <a:fillRect/>
+                    </a:stretch>
+                  </pic:blipFill>
+                  <pic:spPr>
+                    <a:xfrm>
+                      <a:off x="0" y="0"/>
+                      <a:ext cx="5669280" cy="3607724"/>
+                    </a:xfrm>
+                    <a:prstGeom prst="rect"/>
+                  </pic:spPr>
+                </pic:pic>
+              </a:graphicData>
+            </a:graphic>
+          </wp:inline>
+        </w:drawing>
+      </w:r>
+    </w:p>
+    <w:p>
+      <w:pPr>
+        <w:pStyle w:val="Caption"/>
+      </w:pPr>
+      <w:r>
+        <w:t>Hình 2  Mean số chờ trong bin 100 ms tại 800 rps</w:t>
+      </w:r>
+    </w:p>
+    <w:p>
+      <w:r>
+        <w:t>Hai hàng dùng thang dọc khác nhau; gốc thời gian riêng mỗi worker. Đẳng thức hữu hạn do tích phân hàm chỉ thị bằng tổng khoảng chờ; không cần trạng thái dừng. Kiểm tra bằng event sweep và tổng thời gian cùng raw là nhất quán đại số, không kiểm định độc lập hoặc bằng chứng hàng đợi AWS. Chứng minh và số liệu hai worker ở tài liệu 33.</w:t>
+      </w:r>
+    </w:p>
     <w:sectPr>
       <w:footerReference w:type="default" r:id="rId9"/>
       <w:pgSz w:w="12240" w:h="15840"/>

</xml_diff>

<commit_message>
docs: publish validated slots block 2 and historical fan-in diagnostics
</commit_message>
<xml_diff>
--- a/docs/31-phu-luc-bang-chung-thong-ke.docx
+++ b/docs/31-phu-luc-bang-chung-thong-ke.docx
@@ -12,7 +12,7 @@
     </w:p>
     <w:p>
       <w:r>
-        <w:t>Phụ lục đồ án NT531  •  Cập nhật 13/10/2026 16:10 giờ Việt Nam</w:t>
+        <w:t>Phụ lục đồ án NT531  •  Cập nhật 13/10/2026 16:26 giờ Việt Nam</w:t>
       </w:r>
     </w:p>
     <w:p>
@@ -317,7 +317,7 @@
                 <w:b w:val="0"/>
                 <w:sz w:val="21"/>
               </w:rPr>
-              <w:t>1/16</w:t>
+              <w:t>2/16</w:t>
             </w:r>
           </w:p>
         </w:tc>
@@ -4155,7 +4155,7 @@
     </w:p>
     <w:p>
       <w:r>
-        <w:t>Block 1 bắt đầu UTC 2026-10-13T04:39:03.677810+00:00. Đã kiểm tra raw, route, môi trường và log theo request ID; phiên này thuộc mẫu xác nhận, không nhập engineering. Tổng tiến độ 1/16; chưa có kết luận kiểm định hoặc CI liên block.</w:t>
+        <w:t>Block 2 bắt đầu UTC 2026-10-13T09:03:57.465557+00:00. Đã kiểm tra raw, route, môi trường và log theo request ID; phiên này thuộc mẫu xác nhận, không nhập engineering. Tổng tiến độ 2/16; chưa có kết luận kiểm định hoặc CI liên block.</w:t>
       </w:r>
     </w:p>
     <w:tbl>
@@ -4494,7 +4494,7 @@
                 <w:b w:val="0"/>
                 <w:sz w:val="21"/>
               </w:rPr>
-              <w:t>12.109</w:t>
+              <w:t>12.684</w:t>
             </w:r>
           </w:p>
         </w:tc>
@@ -4652,7 +4652,7 @@
                 <w:b w:val="0"/>
                 <w:sz w:val="21"/>
               </w:rPr>
-              <w:t>12.085</w:t>
+              <w:t>12.699</w:t>
             </w:r>
           </w:p>
         </w:tc>
@@ -4810,7 +4810,7 @@
                 <w:b w:val="0"/>
                 <w:sz w:val="21"/>
               </w:rPr>
-              <w:t>12.909</w:t>
+              <w:t>12.879</w:t>
             </w:r>
           </w:p>
         </w:tc>
@@ -4968,7 +4968,7 @@
                 <w:b w:val="0"/>
                 <w:sz w:val="21"/>
               </w:rPr>
-              <w:t>13.243</w:t>
+              <w:t>12.981</w:t>
             </w:r>
           </w:p>
         </w:tc>
@@ -5100,7 +5100,7 @@
                 <w:b w:val="0"/>
                 <w:sz w:val="21"/>
               </w:rPr>
-              <w:t>2.083</w:t>
+              <w:t>3.708</w:t>
             </w:r>
           </w:p>
         </w:tc>
@@ -5126,7 +5126,7 @@
                 <w:b w:val="0"/>
                 <w:sz w:val="21"/>
               </w:rPr>
-              <w:t>1468.798</w:t>
+              <w:t>1499.226</w:t>
             </w:r>
           </w:p>
         </w:tc>
@@ -5284,7 +5284,7 @@
                 <w:b w:val="0"/>
                 <w:sz w:val="21"/>
               </w:rPr>
-              <w:t>12.698</w:t>
+              <w:t>12.660</w:t>
             </w:r>
           </w:p>
         </w:tc>
@@ -5416,7 +5416,7 @@
                 <w:b w:val="0"/>
                 <w:sz w:val="21"/>
               </w:rPr>
-              <w:t>3.283</w:t>
+              <w:t>2.967</w:t>
             </w:r>
           </w:p>
         </w:tc>
@@ -5442,7 +5442,7 @@
                 <w:b w:val="0"/>
                 <w:sz w:val="21"/>
               </w:rPr>
-              <w:t>1327.874</w:t>
+              <w:t>1324.103</w:t>
             </w:r>
           </w:p>
         </w:tc>
@@ -5600,7 +5600,7 @@
                 <w:b w:val="0"/>
                 <w:sz w:val="21"/>
               </w:rPr>
-              <w:t>13.248</w:t>
+              <w:t>12.875</w:t>
             </w:r>
           </w:p>
         </w:tc>
@@ -5613,22 +5613,22 @@
     </w:p>
     <w:p>
       <w:r>
-        <w:t>Tăng đúng hạn 8 → 16 slots tại 800 rps, trung bình hai mode, là 97.3167 điểm phần trăm. Đây là hiệu ứng của block này; chưa khẳng định xác suất lặp lại trong đa số block. Mẫu số giữ mọi yêu cầu theo lịch; P95 chỉ dùng request thành công.</w:t>
+        <w:t>Tăng đúng hạn 8 → 16 slots tại 800 rps, trung bình hai mode, là 96.6625 điểm phần trăm. Đây là hiệu ứng của block này; chưa khẳng định xác suất lặp lại trong đa số block. Mẫu số giữ mọi yêu cầu theo lịch; P95 chỉ dùng request thành công.</w:t>
       </w:r>
     </w:p>
     <w:p>
       <w:r>
-        <w:t>PEERING: P95 chờ C/D ở 8 slots là 1450.151 / 1355.443 ms; ở 16 slots là 0.0097 / 0.0094 ms. Các số này là quantile từng worker, không cộng thành P95 phía A.</w:t>
+        <w:t>PEERING: P95 chờ C/D ở 8 slots là 1480.956 / 1318.759 ms; ở 16 slots là 0.0125 / 0.0080 ms. Các số này là quantile từng worker, không cộng thành P95 phía A.</w:t>
       </w:r>
     </w:p>
     <w:p>
       <w:r>
-        <w:t>TGW: P95 chờ C/D ở 8 slots là 1314.052 / 1293.351 ms; ở 16 slots là 0.0103 / 0.0084 ms. Các số này là quantile từng worker, không cộng thành P95 phía A.</w:t>
+        <w:t>TGW: P95 chờ C/D ở 8 slots là 1305.898 / 1196.660 ms; ở 16 slots là 0.0128 / 0.0078 ms. Các số này là quantile từng worker, không cộng thành P95 phía A.</w:t>
       </w:r>
     </w:p>
     <w:p>
       <w:r>
-        <w:t>Mỗi điều kiện dùng fresh server, warm-up và drain; cùng mã ứng dụng/MTU/cohort. SCP chỉ tải sau capture, host key pin qua SSM, đối chiếu size/SHA. Trước block này có attempt kỹ thuật bị guard uptime chặn: giữ lỗi và quyết định retry, chưa thu outcome; không chọn lại vì kết quả.</w:t>
+        <w:t>Mỗi điều kiện dùng fresh server, warm-up và drain; cùng mã ứng dụng/MTU/cohort. SCP chỉ tải sau capture, host key pin qua SSM, đối chiếu size/SHA. Trước block 1 có attempt kỹ thuật bị guard uptime chặn: giữ lỗi và quyết định retry, chưa thu outcome; không chọn lại vì kết quả.</w:t>
       </w:r>
     </w:p>
     <w:p>
@@ -5646,7 +5646,7 @@
     </w:p>
     <w:p>
       <w:r>
-        <w:t>Phân tích mô tả từ block slots 1, không tạo thêm mẫu xác nhận. Ghép request ID đo, loại warm-up và giữ lời gọi hủy. Mỗi worker có cửa sổ riêng chứa trọn từ entry đầu đến exit cuối, gồm đuôi backlog.</w:t>
+        <w:t>Phân tích mô tả từ block slots 2, không tạo thêm mẫu xác nhận. Ghép request ID đo, loại warm-up và giữ lời gọi hủy. Mỗi worker có cửa sổ riêng chứa trọn từ entry đầu đến exit cuối, gồm đuôi backlog.</w:t>
       </w:r>
     </w:p>
     <w:p>
@@ -6111,7 +6111,7 @@
                 <w:b w:val="0"/>
                 <w:sz w:val="21"/>
               </w:rPr>
-              <w:t>726.588</w:t>
+              <w:t>725.094</w:t>
             </w:r>
           </w:p>
         </w:tc>
@@ -6137,7 +6137,7 @@
                 <w:b w:val="0"/>
                 <w:sz w:val="21"/>
               </w:rPr>
-              <w:t>790.634200</w:t>
+              <w:t>788.478039</w:t>
             </w:r>
           </w:p>
         </w:tc>
@@ -6163,7 +6163,7 @@
                 <w:b w:val="0"/>
                 <w:sz w:val="21"/>
               </w:rPr>
-              <w:t>574.465294</w:t>
+              <w:t>571.720753</w:t>
             </w:r>
           </w:p>
         </w:tc>
@@ -6243,7 +6243,7 @@
                 <w:b w:val="0"/>
                 <w:sz w:val="21"/>
               </w:rPr>
-              <w:t>799.529</w:t>
+              <w:t>799.545</w:t>
             </w:r>
           </w:p>
         </w:tc>
@@ -6269,7 +6269,7 @@
                 <w:b w:val="0"/>
                 <w:sz w:val="21"/>
               </w:rPr>
-              <w:t>0.005352</w:t>
+              <w:t>0.005685</w:t>
             </w:r>
           </w:p>
         </w:tc>
@@ -6295,7 +6295,7 @@
                 <w:b w:val="0"/>
                 <w:sz w:val="21"/>
               </w:rPr>
-              <w:t>0.004279</w:t>
+              <w:t>0.004545</w:t>
             </w:r>
           </w:p>
         </w:tc>
@@ -6375,7 +6375,7 @@
                 <w:b w:val="0"/>
                 <w:sz w:val="21"/>
               </w:rPr>
-              <w:t>733.134</w:t>
+              <w:t>733.118</w:t>
             </w:r>
           </w:p>
         </w:tc>
@@ -6401,7 +6401,7 @@
                 <w:b w:val="0"/>
                 <w:sz w:val="21"/>
               </w:rPr>
-              <w:t>683.339376</w:t>
+              <w:t>676.555388</w:t>
             </w:r>
           </w:p>
         </w:tc>
@@ -6427,7 +6427,7 @@
                 <w:b w:val="0"/>
                 <w:sz w:val="21"/>
               </w:rPr>
-              <w:t>500.979448</w:t>
+              <w:t>495.994692</w:t>
             </w:r>
           </w:p>
         </w:tc>
@@ -6507,7 +6507,7 @@
                 <w:b w:val="0"/>
                 <w:sz w:val="21"/>
               </w:rPr>
-              <w:t>799.601</w:t>
+              <w:t>799.630</w:t>
             </w:r>
           </w:p>
         </w:tc>
@@ -6533,7 +6533,7 @@
                 <w:b w:val="0"/>
                 <w:sz w:val="21"/>
               </w:rPr>
-              <w:t>0.005378</w:t>
+              <w:t>0.005709</w:t>
             </w:r>
           </w:p>
         </w:tc>
@@ -6559,7 +6559,7 @@
                 <w:b w:val="0"/>
                 <w:sz w:val="21"/>
               </w:rPr>
-              <w:t>0.004300</w:t>
+              <w:t>0.004565</w:t>
             </w:r>
           </w:p>
         </w:tc>
@@ -6583,7 +6583,7 @@
               <a:graphicData uri="http://schemas.openxmlformats.org/drawingml/2006/picture">
                 <pic:pic>
                   <pic:nvPicPr>
-                    <pic:cNvPr id="0" name="block-01-queue.png"/>
+                    <pic:cNvPr id="0" name="block-02-queue.png"/>
                     <pic:cNvPicPr/>
                   </pic:nvPicPr>
                   <pic:blipFill>

</xml_diff>

<commit_message>
docs: finalize budget-limited NT531 results and evidence
</commit_message>
<xml_diff>
--- a/docs/31-phu-luc-bang-chung-thong-ke.docx
+++ b/docs/31-phu-luc-bang-chung-thong-ke.docx
@@ -12,7 +12,7 @@
     </w:p>
     <w:p>
       <w:r>
-        <w:t>Phụ lục đồ án NT531  •  Cập nhật 13/10/2026 16:26 giờ Việt Nam</w:t>
+        <w:t>Phụ lục đồ án NT531  •  Cập nhật 13/10/2026 18:32 giờ Việt Nam</w:t>
       </w:r>
     </w:p>
     <w:p>
@@ -157,7 +157,7 @@
                 <w:b/>
                 <w:sz w:val="21"/>
               </w:rPr>
-              <w:t>Mục tiêu</w:t>
+              <w:t>Phạm vi hiện hành</w:t>
             </w:r>
           </w:p>
         </w:tc>
@@ -211,7 +211,7 @@
                 <w:b w:val="0"/>
                 <w:sz w:val="21"/>
               </w:rPr>
-              <w:t>4/16</w:t>
+              <w:t>5</w:t>
             </w:r>
           </w:p>
         </w:tc>
@@ -263,7 +263,7 @@
                 <w:b w:val="0"/>
                 <w:sz w:val="21"/>
               </w:rPr>
-              <w:t>16 block ≥4 ngày</w:t>
+              <w:t>Tối đa 5 block</w:t>
             </w:r>
           </w:p>
         </w:tc>
@@ -317,7 +317,7 @@
                 <w:b w:val="0"/>
                 <w:sz w:val="21"/>
               </w:rPr>
-              <w:t>2/16</w:t>
+              <w:t>3</w:t>
             </w:r>
           </w:p>
         </w:tc>
@@ -369,7 +369,7 @@
                 <w:b w:val="0"/>
                 <w:sz w:val="21"/>
               </w:rPr>
-              <w:t>16 block ≥4 ngày</w:t>
+              <w:t>Tối đa 3 block</w:t>
             </w:r>
           </w:p>
         </w:tc>
@@ -379,6 +379,11 @@
       <w:pPr>
         <w:spacing w:after="20"/>
       </w:pPr>
+    </w:p>
+    <w:p>
+      <w:r>
+        <w:t>Ngày 13/10 rút gọn vì ngân sách: tối đa 5 block RTT/3 slots. Thiết kế gốc 16 block/bốn ngày giữ nguyên để kiểm chứng nhưng chưa hoàn thành; không công bố p-value xác nhận. Kết quả hiện hành là thống kê mô tả, xem tài liệu 35.</w:t>
+      </w:r>
     </w:p>
     <w:p>
       <w:r>
@@ -3438,7 +3443,7 @@
         <w:pStyle w:val="Heading1"/>
       </w:pPr>
       <w:r>
-        <w:t>Kiểm định xác nhận và các ký hiệu</w:t>
+        <w:t>Thiết kế kiểm định gốc và các ký hiệu</w:t>
       </w:r>
     </w:p>
     <w:p>
@@ -4050,7 +4055,7 @@
     </w:p>
     <w:p>
       <w:r>
-        <w:t>Ngưỡng K ≥ 12/16 có pexact tại K = 12 bằng 0,0384063721. Đây là phép tính thiết kế, không phải p-value thực nghiệm hiện tại. Vẫn thu cả 16 block, ≥4 ngày, start cách nhau ≥2 giờ; slots yêu cầu uptime ≥30 phút.</w:t>
+        <w:t>Ngưỡng K ≥ 12/16 có pexact tại K = 12 bằng 0,0384063721. Đây là phép tính thiết kế, không phải p-value thực nghiệm hiện tại. Thiết kế gốc yêu cầu 16 block, ≥4 ngày, start cách nhau ≥2 giờ và uptime slots ≥30 phút; phạm vi rút gọn không áp dụng kiểm định này.</w:t>
       </w:r>
     </w:p>
     <w:p>
@@ -4077,6 +4082,11 @@
       </w:pPr>
       <w:r>
         <w:t>Kết luận phù hợp với bằng chứng</w:t>
+      </w:r>
+    </w:p>
+    <w:p>
+      <w:r>
+        <w:t>Trong 5 block RTT đã kiểm tra, TGW cao hơn Peering trung bình 0.3119 ms, khoảng từng block 0.2303–0.4257 ms. Trong 3 block slots, cải thiện đúng hạn trung bình là 96.8417 điểm phần trăm, khoảng 96.5458–97.3167. Đây là độ lớn hiệu ứng đã quan sát, không phải xác suất hiệu ứng sẽ lặp lại.</w:t>
       </w:r>
     </w:p>
     <w:p>
@@ -4155,7 +4165,7 @@
     </w:p>
     <w:p>
       <w:r>
-        <w:t>Block 2 bắt đầu UTC 2026-10-13T09:03:57.465557+00:00. Đã kiểm tra raw, route, môi trường và log theo request ID; phiên này thuộc mẫu xác nhận, không nhập engineering. Tổng tiến độ 2/16; chưa có kết luận kiểm định hoặc CI liên block.</w:t>
+        <w:t>Block 3 bắt đầu UTC 2026-10-13T11:09:26.935632+00:00. Đã kiểm tra raw, route, môi trường và log theo request ID; phiên này thuộc mẫu xác nhận, không nhập engineering. Đã thu 3 block; giới hạn hiện hành 3. Không công bố kiểm định hoặc CI liên block của mẫu rút gọn.</w:t>
       </w:r>
     </w:p>
     <w:tbl>
@@ -4494,7 +4504,7 @@
                 <w:b w:val="0"/>
                 <w:sz w:val="21"/>
               </w:rPr>
-              <w:t>12.684</w:t>
+              <w:t>12.649</w:t>
             </w:r>
           </w:p>
         </w:tc>
@@ -4652,7 +4662,7 @@
                 <w:b w:val="0"/>
                 <w:sz w:val="21"/>
               </w:rPr>
-              <w:t>12.699</w:t>
+              <w:t>12.681</w:t>
             </w:r>
           </w:p>
         </w:tc>
@@ -4810,7 +4820,7 @@
                 <w:b w:val="0"/>
                 <w:sz w:val="21"/>
               </w:rPr>
-              <w:t>12.879</w:t>
+              <w:t>13.146</w:t>
             </w:r>
           </w:p>
         </w:tc>
@@ -4968,7 +4978,7 @@
                 <w:b w:val="0"/>
                 <w:sz w:val="21"/>
               </w:rPr>
-              <w:t>12.981</w:t>
+              <w:t>13.103</w:t>
             </w:r>
           </w:p>
         </w:tc>
@@ -5100,7 +5110,7 @@
                 <w:b w:val="0"/>
                 <w:sz w:val="21"/>
               </w:rPr>
-              <w:t>3.708</w:t>
+              <w:t>3.342</w:t>
             </w:r>
           </w:p>
         </w:tc>
@@ -5126,7 +5136,7 @@
                 <w:b w:val="0"/>
                 <w:sz w:val="21"/>
               </w:rPr>
-              <w:t>1499.226</w:t>
+              <w:t>1350.096</w:t>
             </w:r>
           </w:p>
         </w:tc>
@@ -5284,7 +5294,7 @@
                 <w:b w:val="0"/>
                 <w:sz w:val="21"/>
               </w:rPr>
-              <w:t>12.660</w:t>
+              <w:t>12.651</w:t>
             </w:r>
           </w:p>
         </w:tc>
@@ -5416,7 +5426,7 @@
                 <w:b w:val="0"/>
                 <w:sz w:val="21"/>
               </w:rPr>
-              <w:t>2.967</w:t>
+              <w:t>3.567</w:t>
             </w:r>
           </w:p>
         </w:tc>
@@ -5442,7 +5452,7 @@
                 <w:b w:val="0"/>
                 <w:sz w:val="21"/>
               </w:rPr>
-              <w:t>1324.103</w:t>
+              <w:t>1225.784</w:t>
             </w:r>
           </w:p>
         </w:tc>
@@ -5600,7 +5610,7 @@
                 <w:b w:val="0"/>
                 <w:sz w:val="21"/>
               </w:rPr>
-              <w:t>12.875</w:t>
+              <w:t>12.916</w:t>
             </w:r>
           </w:p>
         </w:tc>
@@ -5613,17 +5623,17 @@
     </w:p>
     <w:p>
       <w:r>
-        <w:t>Tăng đúng hạn 8 → 16 slots tại 800 rps, trung bình hai mode, là 96.6625 điểm phần trăm. Đây là hiệu ứng của block này; chưa khẳng định xác suất lặp lại trong đa số block. Mẫu số giữ mọi yêu cầu theo lịch; P95 chỉ dùng request thành công.</w:t>
+        <w:t>Tăng đúng hạn 8 → 16 slots tại 800 rps, trung bình hai mode, là 96.5458 điểm phần trăm. Đây là hiệu ứng của block này; chưa khẳng định xác suất lặp lại trong đa số block. Mẫu số giữ mọi yêu cầu theo lịch; P95 chỉ dùng request thành công.</w:t>
       </w:r>
     </w:p>
     <w:p>
       <w:r>
-        <w:t>PEERING: P95 chờ C/D ở 8 slots là 1480.956 / 1318.759 ms; ở 16 slots là 0.0125 / 0.0080 ms. Các số này là quantile từng worker, không cộng thành P95 phía A.</w:t>
+        <w:t>PEERING: P95 chờ C/D ở 8 slots là 1330.590 / 1296.368 ms; ở 16 slots là 0.0078 / 0.0061 ms. Các số này là quantile từng worker, không cộng thành P95 phía A.</w:t>
       </w:r>
     </w:p>
     <w:p>
       <w:r>
-        <w:t>TGW: P95 chờ C/D ở 8 slots là 1305.898 / 1196.660 ms; ở 16 slots là 0.0128 / 0.0078 ms. Các số này là quantile từng worker, không cộng thành P95 phía A.</w:t>
+        <w:t>TGW: P95 chờ C/D ở 8 slots là 1209.163 / 1211.410 ms; ở 16 slots là 0.0081 / 0.0075 ms. Các số này là quantile từng worker, không cộng thành P95 phía A.</w:t>
       </w:r>
     </w:p>
     <w:p>
@@ -5646,7 +5656,7 @@
     </w:p>
     <w:p>
       <w:r>
-        <w:t>Phân tích mô tả từ block slots 2, không tạo thêm mẫu xác nhận. Ghép request ID đo, loại warm-up và giữ lời gọi hủy. Mỗi worker có cửa sổ riêng chứa trọn từ entry đầu đến exit cuối, gồm đuôi backlog.</w:t>
+        <w:t>Phân tích mô tả từ block slots 3, không tạo thêm mẫu xác nhận. Ghép request ID đo, loại warm-up và giữ lời gọi hủy. Mỗi worker có cửa sổ riêng chứa trọn từ entry đầu đến exit cuối, gồm đuôi backlog.</w:t>
       </w:r>
     </w:p>
     <w:p>
@@ -6111,7 +6121,7 @@
                 <w:b w:val="0"/>
                 <w:sz w:val="21"/>
               </w:rPr>
-              <w:t>725.094</w:t>
+              <w:t>732.287</w:t>
             </w:r>
           </w:p>
         </w:tc>
@@ -6137,7 +6147,7 @@
                 <w:b w:val="0"/>
                 <w:sz w:val="21"/>
               </w:rPr>
-              <w:t>788.478039</w:t>
+              <w:t>700.951126</w:t>
             </w:r>
           </w:p>
         </w:tc>
@@ -6163,7 +6173,7 @@
                 <w:b w:val="0"/>
                 <w:sz w:val="21"/>
               </w:rPr>
-              <w:t>571.720753</w:t>
+              <w:t>513.297103</w:t>
             </w:r>
           </w:p>
         </w:tc>
@@ -6243,7 +6253,7 @@
                 <w:b w:val="0"/>
                 <w:sz w:val="21"/>
               </w:rPr>
-              <w:t>799.545</w:t>
+              <w:t>799.531</w:t>
             </w:r>
           </w:p>
         </w:tc>
@@ -6269,7 +6279,7 @@
                 <w:b w:val="0"/>
                 <w:sz w:val="21"/>
               </w:rPr>
-              <w:t>0.005685</w:t>
+              <w:t>0.005239</w:t>
             </w:r>
           </w:p>
         </w:tc>
@@ -6295,7 +6305,7 @@
                 <w:b w:val="0"/>
                 <w:sz w:val="21"/>
               </w:rPr>
-              <w:t>0.004545</w:t>
+              <w:t>0.004189</w:t>
             </w:r>
           </w:p>
         </w:tc>
@@ -6375,7 +6385,7 @@
                 <w:b w:val="0"/>
                 <w:sz w:val="21"/>
               </w:rPr>
-              <w:t>733.118</w:t>
+              <w:t>737.799</w:t>
             </w:r>
           </w:p>
         </w:tc>
@@ -6401,7 +6411,7 @@
                 <w:b w:val="0"/>
                 <w:sz w:val="21"/>
               </w:rPr>
-              <w:t>676.555388</w:t>
+              <w:t>623.637550</w:t>
             </w:r>
           </w:p>
         </w:tc>
@@ -6427,7 +6437,7 @@
                 <w:b w:val="0"/>
                 <w:sz w:val="21"/>
               </w:rPr>
-              <w:t>495.994692</w:t>
+              <w:t>460.119105</w:t>
             </w:r>
           </w:p>
         </w:tc>
@@ -6507,7 +6517,7 @@
                 <w:b w:val="0"/>
                 <w:sz w:val="21"/>
               </w:rPr>
-              <w:t>799.630</w:t>
+              <w:t>799.610</w:t>
             </w:r>
           </w:p>
         </w:tc>
@@ -6533,7 +6543,7 @@
                 <w:b w:val="0"/>
                 <w:sz w:val="21"/>
               </w:rPr>
-              <w:t>0.005709</w:t>
+              <w:t>0.005126</w:t>
             </w:r>
           </w:p>
         </w:tc>
@@ -6559,7 +6569,7 @@
                 <w:b w:val="0"/>
                 <w:sz w:val="21"/>
               </w:rPr>
-              <w:t>0.004565</w:t>
+              <w:t>0.004099</w:t>
             </w:r>
           </w:p>
         </w:tc>
@@ -6583,7 +6593,7 @@
               <a:graphicData uri="http://schemas.openxmlformats.org/drawingml/2006/picture">
                 <pic:pic>
                   <pic:nvPicPr>
-                    <pic:cNvPr id="0" name="block-02-queue.png"/>
+                    <pic:cNvPr id="0" name="block-03-queue.png"/>
                     <pic:cNvPicPr/>
                   </pic:nvPicPr>
                   <pic:blipFill>

</xml_diff>